<commit_message>
Align specifications and planning decisions with confirmed requirements
</commit_message>
<xml_diff>
--- a/docs/planning/MP3_First_Group_Planning_Document.docx
+++ b/docs/planning/MP3_First_Group_Planning_Document.docx
@@ -733,7 +733,9 @@
               <w:spacing w:after="0" w:before="0" w:line="252" w:lineRule="auto"/>
               <w:jc w:val="left"/>
             </w:pPr>
-            <w:r/>
+            <w:r>
+              <w:t>Deployment</w:t>
+            </w:r>
             <w:r>
               <w:rPr>
                 <w:rFonts w:ascii="Aptos" w:hAnsi="Aptos"/>
@@ -741,7 +743,6 @@
                 <w:color w:val="1F1F1F"/>
                 <w:sz w:val="18"/>
               </w:rPr>
-              <w:t>Deployment</w:t>
             </w:r>
           </w:p>
         </w:tc>
@@ -770,7 +771,9 @@
               <w:spacing w:after="0" w:before="0" w:line="252" w:lineRule="auto"/>
               <w:jc w:val="left"/>
             </w:pPr>
-            <w:r/>
+            <w:r>
+              <w:t>Vercel Preview and Production use separate databases and configuration. GitHub Actions deploys a Production candidate, smoke-tests it, and promotes that tested deployment after human approval without rebuilding.</w:t>
+            </w:r>
             <w:r>
               <w:rPr>
                 <w:rFonts w:ascii="Aptos" w:hAnsi="Aptos"/>
@@ -778,7 +781,6 @@
                 <w:color w:val="1F1F1F"/>
                 <w:sz w:val="18"/>
               </w:rPr>
-              <w:t>Two Render services and two databases. GitHub Actions builds one container image and promotes the same image digest from development to production.</w:t>
             </w:r>
           </w:p>
         </w:tc>
@@ -6533,7 +6535,9 @@
               <w:spacing w:after="0" w:before="0" w:line="252" w:lineRule="auto"/>
               <w:jc w:val="center"/>
             </w:pPr>
-            <w:r/>
+            <w:r>
+              <w:t>Preview</w:t>
+            </w:r>
             <w:r>
               <w:rPr>
                 <w:rFonts w:ascii="Aptos" w:hAnsi="Aptos"/>
@@ -6541,7 +6545,6 @@
                 <w:color w:val="1F1F1F"/>
                 <w:sz w:val="17"/>
               </w:rPr>
-              <w:t>Development</w:t>
             </w:r>
           </w:p>
         </w:tc>
@@ -6569,7 +6572,9 @@
               <w:spacing w:after="0" w:before="0" w:line="252" w:lineRule="auto"/>
               <w:jc w:val="center"/>
             </w:pPr>
-            <w:r/>
+            <w:r>
+              <w:t>pull-request commit</w:t>
+            </w:r>
             <w:r>
               <w:rPr>
                 <w:rFonts w:ascii="Aptos" w:hAnsi="Aptos"/>
@@ -6577,7 +6582,6 @@
                 <w:color w:val="1F1F1F"/>
                 <w:sz w:val="17"/>
               </w:rPr>
-              <w:t>develop branch</w:t>
             </w:r>
           </w:p>
         </w:tc>
@@ -6605,7 +6609,9 @@
               <w:spacing w:after="0" w:before="0" w:line="252" w:lineRule="auto"/>
               <w:jc w:val="left"/>
             </w:pPr>
-            <w:r/>
+            <w:r>
+              <w:t>Vercel Preview URL</w:t>
+            </w:r>
             <w:r>
               <w:rPr>
                 <w:rFonts w:ascii="Aptos" w:hAnsi="Aptos"/>
@@ -6613,7 +6619,6 @@
                 <w:color w:val="1F1F1F"/>
                 <w:sz w:val="17"/>
               </w:rPr>
-              <w:t>facilityflow-ai-dev</w:t>
             </w:r>
           </w:p>
         </w:tc>
@@ -6641,7 +6646,9 @@
               <w:spacing w:after="0" w:before="0" w:line="252" w:lineRule="auto"/>
               <w:jc w:val="left"/>
             </w:pPr>
-            <w:r/>
+            <w:r>
+              <w:t>Separate Preview PostgreSQL</w:t>
+            </w:r>
             <w:r>
               <w:rPr>
                 <w:rFonts w:ascii="Aptos" w:hAnsi="Aptos"/>
@@ -6649,7 +6656,6 @@
                 <w:color w:val="1F1F1F"/>
                 <w:sz w:val="17"/>
               </w:rPr>
-              <w:t>Separate development PostgreSQL</w:t>
             </w:r>
           </w:p>
         </w:tc>
@@ -6677,7 +6683,9 @@
               <w:spacing w:after="0" w:before="0" w:line="252" w:lineRule="auto"/>
               <w:jc w:val="left"/>
             </w:pPr>
-            <w:r/>
+            <w:r>
+              <w:t>Synthetic data only; automatic deployment after CI</w:t>
+            </w:r>
             <w:r>
               <w:rPr>
                 <w:rFonts w:ascii="Aptos" w:hAnsi="Aptos"/>
@@ -6685,7 +6693,6 @@
                 <w:color w:val="1F1F1F"/>
                 <w:sz w:val="17"/>
               </w:rPr>
-              <w:t>Synthetic data only; automatic deployment after CI</w:t>
             </w:r>
           </w:p>
         </w:tc>
@@ -6719,7 +6726,9 @@
               <w:spacing w:after="0" w:before="0" w:line="252" w:lineRule="auto"/>
               <w:jc w:val="center"/>
             </w:pPr>
-            <w:r/>
+            <w:r>
+              <w:t>Production</w:t>
+            </w:r>
             <w:r>
               <w:rPr>
                 <w:rFonts w:ascii="Aptos" w:hAnsi="Aptos"/>
@@ -6727,7 +6736,6 @@
                 <w:color w:val="1F1F1F"/>
                 <w:sz w:val="17"/>
               </w:rPr>
-              <w:t>Production</w:t>
             </w:r>
           </w:p>
         </w:tc>
@@ -6756,7 +6764,9 @@
               <w:spacing w:after="0" w:before="0" w:line="252" w:lineRule="auto"/>
               <w:jc w:val="center"/>
             </w:pPr>
-            <w:r/>
+            <w:r>
+              <w:t>protected master branch</w:t>
+            </w:r>
             <w:r>
               <w:rPr>
                 <w:rFonts w:ascii="Aptos" w:hAnsi="Aptos"/>
@@ -6764,7 +6774,6 @@
                 <w:color w:val="1F1F1F"/>
                 <w:sz w:val="17"/>
               </w:rPr>
-              <w:t>protected master branch</w:t>
             </w:r>
           </w:p>
         </w:tc>
@@ -6793,7 +6802,9 @@
               <w:spacing w:after="0" w:before="0" w:line="252" w:lineRule="auto"/>
               <w:jc w:val="left"/>
             </w:pPr>
-            <w:r/>
+            <w:r>
+              <w:t>Vercel Production</w:t>
+            </w:r>
             <w:r>
               <w:rPr>
                 <w:rFonts w:ascii="Aptos" w:hAnsi="Aptos"/>
@@ -6801,7 +6812,6 @@
                 <w:color w:val="1F1F1F"/>
                 <w:sz w:val="17"/>
               </w:rPr>
-              <w:t>facilityflow-ai-prod</w:t>
             </w:r>
           </w:p>
         </w:tc>
@@ -6830,7 +6840,9 @@
               <w:spacing w:after="0" w:before="0" w:line="252" w:lineRule="auto"/>
               <w:jc w:val="left"/>
             </w:pPr>
-            <w:r/>
+            <w:r>
+              <w:t>Separate Production PostgreSQL</w:t>
+            </w:r>
             <w:r>
               <w:rPr>
                 <w:rFonts w:ascii="Aptos" w:hAnsi="Aptos"/>
@@ -6838,7 +6850,6 @@
                 <w:color w:val="1F1F1F"/>
                 <w:sz w:val="17"/>
               </w:rPr>
-              <w:t>Separate production PostgreSQL</w:t>
             </w:r>
           </w:p>
         </w:tc>
@@ -6867,7 +6878,9 @@
               <w:spacing w:after="0" w:before="0" w:line="252" w:lineRule="auto"/>
               <w:jc w:val="left"/>
             </w:pPr>
-            <w:r/>
+            <w:r>
+              <w:t>Manual GitHub Environment approval; promote the smoke-tested deployment without rebuilding</w:t>
+            </w:r>
             <w:r>
               <w:rPr>
                 <w:rFonts w:ascii="Aptos" w:hAnsi="Aptos"/>
@@ -6875,7 +6888,6 @@
                 <w:color w:val="1F1F1F"/>
                 <w:sz w:val="17"/>
               </w:rPr>
-              <w:t>Manual GitHub Environment approval; deploy the already tested image digest</w:t>
             </w:r>
           </w:p>
         </w:tc>
@@ -6897,7 +6909,7 @@
           <w:color w:val="1F1F1F"/>
           <w:sz w:val="21"/>
         </w:rPr>
-        <w:t>GitHub Actions will compile, test, scan, build a Docker image, publish it to GitHub Container Registry, deploy to development, run smoke tests, and then allow manual promotion of the same immutable digest to production. Render will run the supplied image; it will not be used as the build source of truth. Development and production will have separate services, databases, hostnames, secrets, and SoC LLM credentials or quotas where available.</w:t>
+        <w:t>GitHub Actions will compile, test, scan, deploy pull request commits to Vercel Preview with Preview configuration, and deploy an approved Production candidate without assigning the production domain. After independent smoke tests, a human-approved Vercel promotion assigns the production domain to that tested deployment without rebuilding. Preview and Production will have separate databases, hostnames, secrets, and SoC LLM credentials or quotas where available.</w:t>
       </w:r>
     </w:p>
     <w:p>
@@ -7569,7 +7581,7 @@
           <w:color w:val="1F1F1F"/>
           <w:sz w:val="21"/>
         </w:rPr>
-        <w:t>FacilityFlow AI will reuse the MP2 problem domain and selected Java logic from the FacilityFlow release at commit cbfeb8f dated 29 September 2026. The web interface, deployment model, AI features, AI security controls, SDD workflow, and multi agent workflow are new MP3 work. Reuse will be measured and acknowledged rather than described only in general terms.</w:t>
+        <w:t>FacilityFlow AI will reuse the MP2 problem domain and selected Java logic from the verified latest master commit 9819b857d880134c1fc1ffef8a8bcd5d6e536f43 dated 29 September 2026. The web interface, deployment model, AI features, AI security controls, SDD workflow, and multi agent workflow are new MP3 work. Reuse will be measured and acknowledged rather than described only in general terms.</w:t>
       </w:r>
     </w:p>
     <w:tbl>
@@ -10318,7 +10330,7 @@
           <w:color w:val="1F1F1F"/>
           <w:sz w:val="20"/>
         </w:rPr>
-        <w:t>The development and production environments use separate services, data, configuration, and secrets. Production deployment requires human approval and promotes a tested image digest.</w:t>
+        <w:t>The Preview and Production environments use separate data, configuration, and secrets. Production deployment requires human approval and promotes a smoke-tested Vercel deployment without rebuilding.</w:t>
       </w:r>
     </w:p>
     <w:p>

</xml_diff>